<commit_message>
Expand all six literature review sections
Each funnel section now runs five to six paragraphs with fuller detail on
methods, samples and findings from the same 32 verified sources; no new
sources added.

Co-Authored-By: Claude Fable 5 <noreply@anthropic.com>
Claude-Session: https://claude.ai/code/session_01AjM11GFfrxyiDV2Q3kcPRu
</commit_message>
<xml_diff>
--- a/literature-review/סקירת ספרות - בינה מלאכותית ומסוגלות עצמית של מורים.docx
+++ b/literature-review/סקירת ספרות - בינה מלאכותית ומסוגלות עצמית של מורים.docx
@@ -441,47 +441,87 @@
           <w:szCs w:val="24"/>
           <w:rtl/>
         </w:rPr>
-        <w:t xml:space="preserve">שילוב טכנולוגיות דיגיטליות בהוראה נמצא על סדר יומן של מערכות חינוך כבר שני עשורים ויותר, ובכל זאת ההטמעה בפועל רחוקה מלהיות אחידה. מחקר שבחן מדוע מורים לשפת אם ממעטים לשלב טכנולוגיה בשיעוריהם מצא שהחסם העיקרי אינו מחסור במיומנות טכנית אלא מה שהחוקרות מכנות מחסום דיסציפלינרי: תפיסה מצומצמת של האופן שבו התקשוב יכול לשרת את מטרות ההוראה של תחום הדעת עצמו. מסקנתן היא שהכשרה טכנולוגית כללית אינה מספיקה, ונדרש פיתוח מקצועי הקושר את הכלי הדיגיטלי אל הפדגוגיה של הדיסציפלינה (אבידב-אונגר ועמיר, 2018, 2021).</w:t>
-      </w:r>
-    </w:p>
-    <w:p>
-      <w:pPr>
-        <w:bidi/>
-        <w:spacing w:after="0" w:line="480" w:lineRule="auto"/>
-        <w:jc w:val="start"/>
-      </w:pPr>
-      <w:r>
-        <w:rPr>
-          <w:rFonts w:ascii="Times New Roman" w:cs="David" w:hAnsi="Times New Roman"/>
-          <w:b w:val="false"/>
-          <w:bCs w:val="false"/>
-          <w:i w:val="false"/>
-          <w:iCs w:val="false"/>
-          <w:sz w:val="24"/>
-          <w:szCs w:val="24"/>
-          <w:rtl/>
-        </w:rPr>
-        <w:t xml:space="preserve">משבר הקורונה חשף את הפער הזה במלוא חריפותו. מחקר פנומנולוגי שנערך בקרב 22 מורות ומורים בבתי ספר יסודיים ובחטיבות ביניים מצא כי המעבר להוראה מקוונת נעשה באופן חצי ספונטני, נשען על תושייה אישית של מורים, וכמעט ללא מנגנון בית ספרי מאורגן לגישור על הפער הדיגיטלי (רייכל ואלט, 2023).</w:t>
-      </w:r>
-    </w:p>
-    <w:p>
-      <w:pPr>
-        <w:bidi/>
-        <w:spacing w:after="0" w:line="480" w:lineRule="auto"/>
-        <w:jc w:val="start"/>
-      </w:pPr>
-      <w:r>
-        <w:rPr>
-          <w:rFonts w:ascii="Times New Roman" w:cs="David" w:hAnsi="Times New Roman"/>
-          <w:b w:val="false"/>
-          <w:bCs w:val="false"/>
-          <w:i w:val="false"/>
-          <w:iCs w:val="false"/>
-          <w:sz w:val="24"/>
-          <w:szCs w:val="24"/>
-          <w:rtl/>
-        </w:rPr>
-        <w:t xml:space="preserve">גם בצד התלמידים התמונה מורכבת. בחינה של עמדות תלמידי כיתה י' כלפי לימוד ביולוגיה בסביבה מתוקשבת העלתה עמדות חיוביות בכלל המדגם, לצד הבדלים מובהקים בין בנים לבנות ובין תלמידים בעלי ניסיון קודם בלמידה מתוקשבת לחסרי ניסיון כזה. נראה אפוא שהניסיון המצטבר עם הטכנולוגיה מעצב את היחס אליה, ומכאן קצרה הדרך לשאלה כיצד יגיבו מורים ותלמידים לגל הטכנולוגי הבא, הבינה המלאכותית (כהן וליברמן, 2025).</w:t>
+        <w:t xml:space="preserve">שילוב טכנולוגיות דיגיטליות בהוראה נמצא על סדר יומן של מערכות חינוך כבר שני עשורים ויותר, ובכל זאת ההטמעה בפועל רחוקה מלהיות אחידה. בין כיתה לכיתה, ולעיתים בין מורה למורה באותו בית ספר, נמצאים פערים ניכרים בהיקף השימוש בכלים דיגיטליים ובאופיו. הספרות המחקרית מבחינה בין חסמים חיצוניים, כגון תשתית וזמינות ציוד, ובין חסמים פנימיים הנוגעים לעמדות המורה, לידע שלו ולתפיסותיו הפדגוגיות, ומצביעה על כך שדווקא החסמים הפנימיים עמידים יותר לשינוי (אבידב-אונגר ועמיר, 2021).</w:t>
+      </w:r>
+    </w:p>
+    <w:p>
+      <w:pPr>
+        <w:bidi/>
+        <w:spacing w:after="0" w:line="480" w:lineRule="auto"/>
+        <w:jc w:val="start"/>
+      </w:pPr>
+      <w:r>
+        <w:rPr>
+          <w:rFonts w:ascii="Times New Roman" w:cs="David" w:hAnsi="Times New Roman"/>
+          <w:b w:val="false"/>
+          <w:bCs w:val="false"/>
+          <w:i w:val="false"/>
+          <w:iCs w:val="false"/>
+          <w:sz w:val="24"/>
+          <w:szCs w:val="24"/>
+          <w:rtl/>
+        </w:rPr>
+        <w:t xml:space="preserve">מחקר שבחן מדוע מורים לשפת אם ממעטים לשלב טכנולוגיה בשיעוריהם ממחיש זאת היטב. החסם העיקרי שנמצא לא היה מחסור במיומנות טכנית, שכן המורים שנבדקו ידעו להפעיל את הכלים, אלא מה שהחוקרות מכנות מחסום דיסציפלינרי: תפיסה מצומצמת של האופן שבו התקשוב יכול לשרת את מטרות ההוראה של תחום הדעת עצמו. מורה עשוי לשלוט היטב במצגות ובסביבות תוכן דיגיטליות ועדיין לא לראות כיצד הן מקדמות הבנה של טקסט או הבעה בכתב. מסקנת החוקרות היא שהכשרה טכנולוגית כללית אינה מספיקה, ונדרש פיתוח מקצועי הקושר את הכלי הדיגיטלי אל הפדגוגיה של הדיסציפלינה ואל תוכני ההוראה עצמם (אבידב-אונגר ועמיר, 2018, 2021).</w:t>
+      </w:r>
+    </w:p>
+    <w:p>
+      <w:pPr>
+        <w:bidi/>
+        <w:spacing w:after="0" w:line="480" w:lineRule="auto"/>
+        <w:jc w:val="start"/>
+      </w:pPr>
+      <w:r>
+        <w:rPr>
+          <w:rFonts w:ascii="Times New Roman" w:cs="David" w:hAnsi="Times New Roman"/>
+          <w:b w:val="false"/>
+          <w:bCs w:val="false"/>
+          <w:i w:val="false"/>
+          <w:iCs w:val="false"/>
+          <w:sz w:val="24"/>
+          <w:szCs w:val="24"/>
+          <w:rtl/>
+        </w:rPr>
+        <w:t xml:space="preserve">משבר הקורונה חשף את הפערים האלה במלוא חריפותם. מחקר פנומנולוגי שנערך בקרב 22 מורות ומורים בבתי ספר יסודיים ובחטיבות ביניים תיעד את חוויית המעבר החד להוראה מקוונת ומצא שהוא נעשה באופן חצי ספונטני: מורים גישרו על הפער הדיגיטלי בכוחות עצמם, מתוך תושייה אישית ולמידה עצמית, וכמעט ללא מנגנון בית ספרי מאורגן שילווה אותם. לצד החסמים זוהו גם גורמים מסייעים, ובראשם עמיתים לעבודה וניסיון קודם עם סביבות דיגיטליות, אך אלה פעלו באקראי ולא כחלק ממדיניות סדורה (רייכל ואלט, 2023).</w:t>
+      </w:r>
+    </w:p>
+    <w:p>
+      <w:pPr>
+        <w:bidi/>
+        <w:spacing w:after="0" w:line="480" w:lineRule="auto"/>
+        <w:jc w:val="start"/>
+      </w:pPr>
+      <w:r>
+        <w:rPr>
+          <w:rFonts w:ascii="Times New Roman" w:cs="David" w:hAnsi="Times New Roman"/>
+          <w:b w:val="false"/>
+          <w:bCs w:val="false"/>
+          <w:i w:val="false"/>
+          <w:iCs w:val="false"/>
+          <w:sz w:val="24"/>
+          <w:szCs w:val="24"/>
+          <w:rtl/>
+        </w:rPr>
+        <w:t xml:space="preserve">גם בצד התלמידים התמונה מורכבת. בחינה של עמדות תלמידי כיתה י' כלפי לימוד ביולוגיה בסביבה מתוקשבת, שנעשתה באמצעות שאלון עמדות מתוקף ושאלות פתוחות על העדפות למידה עתידיות, העלתה עמדות חיוביות בכלל המדגם. עם זאת נמצאו הבדלים מובהקים בין בנים לבנות ובין תלמידים בעלי ניסיון קודם בלמידה מתוקשבת לחסרי ניסיון כזה, וכן בין מי שלומדים בסביבה מתוקשבת בהיקף נרחב ובין מי שנחשפים אליה מעט (כהן וליברמן, 2025).</w:t>
+      </w:r>
+    </w:p>
+    <w:p>
+      <w:pPr>
+        <w:bidi/>
+        <w:spacing w:after="0" w:line="480" w:lineRule="auto"/>
+        <w:jc w:val="start"/>
+      </w:pPr>
+      <w:r>
+        <w:rPr>
+          <w:rFonts w:ascii="Times New Roman" w:cs="David" w:hAnsi="Times New Roman"/>
+          <w:b w:val="false"/>
+          <w:bCs w:val="false"/>
+          <w:i w:val="false"/>
+          <w:iCs w:val="false"/>
+          <w:sz w:val="24"/>
+          <w:szCs w:val="24"/>
+          <w:rtl/>
+        </w:rPr>
+        <w:t xml:space="preserve">משתי נקודות המבט, של המורים ושל התלמידים, עולה מסקנה דומה: היחס לטכנולוגיה חינוכית אינו נקבע על ידי הכלי עצמו אלא על ידי הניסיון המצטבר עמו, על ידי התפיסות הפדגוגיות ועל ידי הסביבה המלווה את השימוש. מסקנה זו מקבלת משנה תוקף כאשר על הפרק עומדת טכנולוגיה חדשה ושונה מקודמותיה, הבינה המלאכותית, שבה עוסק המשך הסקירה.</w:t>
       </w:r>
     </w:p>
     <w:p>
@@ -521,67 +561,87 @@
           <w:szCs w:val="24"/>
           <w:rtl/>
         </w:rPr>
-        <w:t xml:space="preserve">בינה מלאכותית בחינוך אינה תופעה חדשה. סקירה שיטתית של 146 פרסומים מהשנים 2007 עד 2018 מיפתה ארבעה אשכולות יישום עיקריים בהשכלה הגבוהה: יצירת פרופיל וחיזוי הישגים, מערכות הוראה אינטליגנטיות, מדידה והערכה, ומערכות מסתגלות ללומד. אותה סקירה הצביעה על ממצא מטריד: רוב המחקרים נכתבו בידי חוקרים מתחומי מדעי המחשב, וקולם של אנשי החינוך כמעט נעדר מהשיח (Zawacki-Richter et al., 2019).</w:t>
-      </w:r>
-    </w:p>
-    <w:p>
-      <w:pPr>
-        <w:bidi/>
-        <w:spacing w:after="0" w:line="480" w:lineRule="auto"/>
-        <w:jc w:val="start"/>
-      </w:pPr>
-      <w:r>
-        <w:rPr>
-          <w:rFonts w:ascii="Times New Roman" w:cs="David" w:hAnsi="Times New Roman"/>
-          <w:b w:val="false"/>
-          <w:bCs w:val="false"/>
-          <w:i w:val="false"/>
-          <w:iCs w:val="false"/>
-          <w:sz w:val="24"/>
-          <w:szCs w:val="24"/>
-          <w:rtl/>
-        </w:rPr>
-        <w:t xml:space="preserve">סקירה שיטתית עדכנית יותר זיהתה שלושה עשר תפקידים של בינה מלאכותית בארבעה תחומי פעילות, הוראה, למידה, הערכה ומינהל, לצד עשרה אתגרים מרכזיים, ובהם פערי אוריינות טכנולוגית של מורים, סוגיות אתיות והיעדר מסגרות פדגוגיות סדורות ליישום. המסקנה העולה משתי הסקירות דומה: הפוטנציאל גדול, אך מימושו תלוי במורים עצמם (Chiu et al., 2023).</w:t>
-      </w:r>
-    </w:p>
-    <w:p>
-      <w:pPr>
-        <w:bidi/>
-        <w:spacing w:after="0" w:line="480" w:lineRule="auto"/>
-        <w:jc w:val="start"/>
-      </w:pPr>
-      <w:r>
-        <w:rPr>
-          <w:rFonts w:ascii="Times New Roman" w:cs="David" w:hAnsi="Times New Roman"/>
-          <w:b w:val="false"/>
-          <w:bCs w:val="false"/>
-          <w:i w:val="false"/>
-          <w:iCs w:val="false"/>
-          <w:sz w:val="24"/>
-          <w:szCs w:val="24"/>
-          <w:rtl/>
-        </w:rPr>
-        <w:t xml:space="preserve">ממצא מעניין בהקשר זה נוגע דווקא ללומדים צעירים. בקרב 682 תלמידי בית ספר יסודי נמצא כי תחושת המסוגלות ללמוד בינה מלאכותית, לצד תפיסת תרומתה החברתית, ניבאה את הכוונה להמשיך וללמוד את התחום. תחושת מסוגלות מסתמנת כבר כאן כמשתנה מפתח בהתמודדות עם הטכנולוגיה, רעיון שילווה את הסקירה בהמשכה גם ביחס למורים (Chai et al., 2021).</w:t>
-      </w:r>
-    </w:p>
-    <w:p>
-      <w:pPr>
-        <w:bidi/>
-        <w:spacing w:after="0" w:line="480" w:lineRule="auto"/>
-        <w:jc w:val="start"/>
-      </w:pPr>
-      <w:r>
-        <w:rPr>
-          <w:rFonts w:ascii="Times New Roman" w:cs="David" w:hAnsi="Times New Roman"/>
-          <w:b w:val="false"/>
-          <w:bCs w:val="false"/>
-          <w:i w:val="false"/>
-          <w:iCs w:val="false"/>
-          <w:sz w:val="24"/>
-          <w:szCs w:val="24"/>
-          <w:rtl/>
-        </w:rPr>
-        <w:t xml:space="preserve">בישראל פועל מאז תשפ"ג מערך מחקר ופיתוח ממשלתי שנועד להטמיע בינה מלאכותית בבתי הספר באופן מדורג ואחראי, הכולל ניסויים מבוקרים במוסדות חינוך, ליווי מחקרי והכשרת מורים. עצם קיומו של מערך כזה מלמד שהשאלה אינה עוד אם הבינה המלאכותית תיכנס לכיתות, אלא כיצד ובאיזה קצב (גיל ואחרים, 2025).</w:t>
+        <w:t xml:space="preserve">בינה מלאכותית בחינוך אינה תופעה חדשה. עוד לפני הופעת הכלים היוצרים נחקרו ויושמו מערכות המבוססות על למידת מכונה ועל עיבוד נתונים חינוכיים. סקירה שיטתית שבחנה 2,656 פרסומים מהשנים 2007 עד 2018 וניתחה לעומק 146 מהם מיפתה ארבעה אשכולות יישום עיקריים בהשכלה הגבוהה: יצירת פרופיל של לומדים וחיזוי הישגים ונשירה, מערכות הוראה אינטליגנטיות המדמות מורה פרטי, כלי מדידה והערכה אוטומטיים, ומערכות מסתגלות המכווננות את חומרי הלמידה ללומד היחיד (Zawacki-Richter et al., 2019).</w:t>
+      </w:r>
+    </w:p>
+    <w:p>
+      <w:pPr>
+        <w:bidi/>
+        <w:spacing w:after="0" w:line="480" w:lineRule="auto"/>
+        <w:jc w:val="start"/>
+      </w:pPr>
+      <w:r>
+        <w:rPr>
+          <w:rFonts w:ascii="Times New Roman" w:cs="David" w:hAnsi="Times New Roman"/>
+          <w:b w:val="false"/>
+          <w:bCs w:val="false"/>
+          <w:i w:val="false"/>
+          <w:iCs w:val="false"/>
+          <w:sz w:val="24"/>
+          <w:szCs w:val="24"/>
+          <w:rtl/>
+        </w:rPr>
+        <w:t xml:space="preserve">אותה סקירה העלתה גם ממצא מטריד על אודות המחקר עצמו. רוב הפרסומים נכתבו בידי חוקרים מתחומי מדעי המחשב וההנדסה, נשענו על שיטות כמותיות, וכמעט לא כללו התבוננות פדגוגית או ביקורתית. קולם של אנשי החינוך, אלה שאמורים ליישם את המערכות בכיתות, כמעט נעדר מהשיח המחקרי, והחוקרים רואים בכך פער הדורש תיקון (Zawacki-Richter et al., 2019).</w:t>
+      </w:r>
+    </w:p>
+    <w:p>
+      <w:pPr>
+        <w:bidi/>
+        <w:spacing w:after="0" w:line="480" w:lineRule="auto"/>
+        <w:jc w:val="start"/>
+      </w:pPr>
+      <w:r>
+        <w:rPr>
+          <w:rFonts w:ascii="Times New Roman" w:cs="David" w:hAnsi="Times New Roman"/>
+          <w:b w:val="false"/>
+          <w:bCs w:val="false"/>
+          <w:i w:val="false"/>
+          <w:iCs w:val="false"/>
+          <w:sz w:val="24"/>
+          <w:szCs w:val="24"/>
+          <w:rtl/>
+        </w:rPr>
+        <w:t xml:space="preserve">סקירה שיטתית עדכנית יותר הרחיבה את המיפוי אל מערכת החינוך כולה וזיהתה שלושה עשר תפקידים של בינה מלאכותית בארבעה תחומי פעילות: הוראה, למידה, הערכה ומינהל חינוכי. לצד שבעה סוגים של תוצרי למידה שהמערכות נמצאו מקדמות, מנתה הסקירה עשרה אתגרים, ובהם פערי אוריינות טכנולוגית של מורים, חשש מפגיעה באוטונומיה המקצועית, סוגיות אתיות של פרטיות והוגנות, והיעדר מסגרות פדגוגיות סדורות ליישום. המסקנה העולה משתי הסקירות דומה: הפוטנציאל גדול, אך מימושו תלוי במורים עצמם ובמידת מוכנותם (Chiu et al., 2023).</w:t>
+      </w:r>
+    </w:p>
+    <w:p>
+      <w:pPr>
+        <w:bidi/>
+        <w:spacing w:after="0" w:line="480" w:lineRule="auto"/>
+        <w:jc w:val="start"/>
+      </w:pPr>
+      <w:r>
+        <w:rPr>
+          <w:rFonts w:ascii="Times New Roman" w:cs="David" w:hAnsi="Times New Roman"/>
+          <w:b w:val="false"/>
+          <w:bCs w:val="false"/>
+          <w:i w:val="false"/>
+          <w:iCs w:val="false"/>
+          <w:sz w:val="24"/>
+          <w:szCs w:val="24"/>
+          <w:rtl/>
+        </w:rPr>
+        <w:t xml:space="preserve">ממצא מעניין בהקשר זה נוגע דווקא ללומדים צעירים. מחקר שנערך בקרב 682 תלמידי בית ספר יסודי, על בסיס תאוריית ההתנהגות המתוכננת, בדק מה מנבא את כוונתם להמשיך וללמוד בינה מלאכותית. נמצא שתחושת המסוגלות ללמוד את התחום, מוכנות לבינה מלאכותית, תפיסת תרומתה לחברה ורמת האוריינות בתחום ניבאו יחד את כוונת הלמידה. תחושת מסוגלות מסתמנת כבר כאן כמשתנה מפתח בהתמודדות עם הטכנולוגיה, רעיון שילווה את הסקירה בהמשכה גם ביחס למורים (Chai et al., 2021).</w:t>
+      </w:r>
+    </w:p>
+    <w:p>
+      <w:pPr>
+        <w:bidi/>
+        <w:spacing w:after="0" w:line="480" w:lineRule="auto"/>
+        <w:jc w:val="start"/>
+      </w:pPr>
+      <w:r>
+        <w:rPr>
+          <w:rFonts w:ascii="Times New Roman" w:cs="David" w:hAnsi="Times New Roman"/>
+          <w:b w:val="false"/>
+          <w:bCs w:val="false"/>
+          <w:i w:val="false"/>
+          <w:iCs w:val="false"/>
+          <w:sz w:val="24"/>
+          <w:szCs w:val="24"/>
+          <w:rtl/>
+        </w:rPr>
+        <w:t xml:space="preserve">בישראל קיבלה הסוגיה מענה ממסדי. מאז תשפ"ג פועל מערך מחקר ופיתוח ממשלתי שנועד להטמיע בינה מלאכותית בבתי הספר באופן מדורג ואחראי. המערך כולל ניסויים מבוקרים ביישומי בינה מלאכותית במוסדות חינוך, ליווי מחקרי של תהליכי ההטמעה והכשרת מורים ייעודית, מתוך תפיסה שהטמעה רחבת היקף מחייבת תשתית של ידע ולא אלתור נקודתי. עצם קיומו של מערך כזה מלמד שהשאלה אינה עוד אם הבינה המלאכותית תיכנס לכיתות, אלא כיצד ובאיזה קצב (גיל ואחרים, 2025).</w:t>
       </w:r>
     </w:p>
     <w:p>
@@ -621,67 +681,107 @@
           <w:szCs w:val="24"/>
           <w:rtl/>
         </w:rPr>
-        <w:t xml:space="preserve">השקת ChatGPT בסוף 2022 העבירה את הדיון מהתחום המקצועי הצר אל לב השיח החינוכי. בניגוד למערכות קודמות, כלי בינה מלאכותית יוצרת מנהלים שיח בשפה אנושית ומפיקים טקסטים שלמים על פי בקשה, ולכן הם נוגעים ישירות בליבת העשייה של מורים ותלמידים: כתיבה, סיכום, פתרון משימות והערכה. ניתוח האתגרים שמציב הכלי למערכת החינוך מצביע על סכנת פגיעה במהימנות ההערכה, על הטיות ושגיאות בתוכן המופק, ועל הצורך לעצב מחדש משימות למידה, ומסקנתו היא שאיסור גורף אינו מעשי ונדרשת היערכות פדגוגית יצירתית (מישר-טל, 2023).</w:t>
-      </w:r>
-    </w:p>
-    <w:p>
-      <w:pPr>
-        <w:bidi/>
-        <w:spacing w:after="0" w:line="480" w:lineRule="auto"/>
-        <w:jc w:val="start"/>
-      </w:pPr>
-      <w:r>
-        <w:rPr>
-          <w:rFonts w:ascii="Times New Roman" w:cs="David" w:hAnsi="Times New Roman"/>
-          <w:b w:val="false"/>
-          <w:bCs w:val="false"/>
-          <w:i w:val="false"/>
-          <w:iCs w:val="false"/>
-          <w:sz w:val="24"/>
-          <w:szCs w:val="24"/>
-          <w:rtl/>
-        </w:rPr>
-        <w:t xml:space="preserve">מחקרים על לומדים מציירים תמונה דו-ערכית. סקר בקרב 399 סטודנטים בהונג קונג מצא עמדות חיוביות בסך הכול, לצד חששות מדיוק המידע, מפרטיות ומהשפעה על התפתחותם האישית והמקצועית (Chan &amp; Hu, 2023). מחקר איכותני שבחן את גורמי האימוץ של הכלי בקרב משתמשים העלה כי לצד ציפיות הביצוע והמאמץ פועלים גם גורמים ייחודיים לכלי שיחני, ובראשם תחושת האינטראקטיביות וחששות פרטיות (Menon &amp; Shilpa, 2023).</w:t>
-      </w:r>
-    </w:p>
-    <w:p>
-      <w:pPr>
-        <w:bidi/>
-        <w:spacing w:after="0" w:line="480" w:lineRule="auto"/>
-        <w:jc w:val="start"/>
-      </w:pPr>
-      <w:r>
-        <w:rPr>
-          <w:rFonts w:ascii="Times New Roman" w:cs="David" w:hAnsi="Times New Roman"/>
-          <w:b w:val="false"/>
-          <w:bCs w:val="false"/>
-          <w:i w:val="false"/>
-          <w:iCs w:val="false"/>
-          <w:sz w:val="24"/>
-          <w:szCs w:val="24"/>
-          <w:rtl/>
-        </w:rPr>
-        <w:t xml:space="preserve">בשדה הישראלי מצטברות עדויות ראשונות מבתי הספר עצמם. בבתי ספר יסודיים נמצא ששימוש מונחה של מורים בכלים יוצרים שינה את אופן תכנון השיעורים וקידם מיומנויות דיגיטליות, ובחינוך העל-יסודי זוהו שישה סוגי פעילויות ראשוניות שמורים מבצעים עם תלמידיהם, מהיכרות ביקורתית עם הכלי ועד עבודה יצירתית עצמאית (לוי-נדב ואחרים, 2024, 2025). מחקר פעולה שליווה הטמעה מבוקרת בבית ספר יסודי תיאר שינוי עמוק יותר: תפקיד המורה נע ממעביר ידע אל מנחה ושותף לחקר (וילדר ממן וזייפרט, 2026).</w:t>
-      </w:r>
-    </w:p>
-    <w:p>
-      <w:pPr>
-        <w:bidi/>
-        <w:spacing w:after="0" w:line="480" w:lineRule="auto"/>
-        <w:jc w:val="start"/>
-      </w:pPr>
-      <w:r>
-        <w:rPr>
-          <w:rFonts w:ascii="Times New Roman" w:cs="David" w:hAnsi="Times New Roman"/>
-          <w:b w:val="false"/>
-          <w:bCs w:val="false"/>
-          <w:i w:val="false"/>
-          <w:iCs w:val="false"/>
-          <w:sz w:val="24"/>
-          <w:szCs w:val="24"/>
-          <w:rtl/>
-        </w:rPr>
-        <w:t xml:space="preserve">לצד ההזדמנויות מתחדד המתח האתי. בקרב 399 סטודנטים משישה מוסדות אקדמיים בישראל נמצא מתח בין דרישות היושרה האקדמית ובין הציפייה לרכוש שליטה בכלים הנדרשים בשוק העבודה, והחוקרים ממליצים לראות בו הזדמנות לפיתוח שיקול דעת אתי בהנחיית הסגל (דוידוביץ' וודמני, 2025). ממצא זה מתיישב עם התפיסה שיושרה אקדמית אינה נתון קבוע אלא מיומנות המתפתחת לאורך הלימודים, ולכן ניתנת לטיפוח (גרוס אבינר ומאירוביץ, 2021).</w:t>
+        <w:t xml:space="preserve">השקת ChatGPT בסוף 2022 העבירה את הדיון מהתחום המקצועי הצר אל לב השיח החינוכי. בניגוד למערכות שתוארו בפרק הקודם, שפעלו ברקע ובאמצעות ממשקים ייעודיים, כלי בינה מלאכותית יוצרת מנהלים שיח בשפה אנושית ומפיקים על פי בקשה טקסטים שלמים, סיכומים, תרגומים ופתרונות למשימות. בכך הם נוגעים ישירות בליבת העשייה של מורים ותלמידים: כתיבה, קריאה, הכנת שיעורים והערכת עבודות. הנגישות המיידית של הכלי לכל תלמיד עם חיבור לרשת הפכה אותו מסוגיה טכנולוגית לסוגיה פדגוגית מן המעלה הראשונה (מישר-טל, 2023).</w:t>
+      </w:r>
+    </w:p>
+    <w:p>
+      <w:pPr>
+        <w:bidi/>
+        <w:spacing w:after="0" w:line="480" w:lineRule="auto"/>
+        <w:jc w:val="start"/>
+      </w:pPr>
+      <w:r>
+        <w:rPr>
+          <w:rFonts w:ascii="Times New Roman" w:cs="David" w:hAnsi="Times New Roman"/>
+          <w:b w:val="false"/>
+          <w:bCs w:val="false"/>
+          <w:i w:val="false"/>
+          <w:iCs w:val="false"/>
+          <w:sz w:val="24"/>
+          <w:szCs w:val="24"/>
+          <w:rtl/>
+        </w:rPr>
+        <w:t xml:space="preserve">ניתוח האתגרים שמציב הכלי למערכת החינוך מונה כמה חזיתות. הראשונה היא מהימנות ההערכה: כאשר תלמיד יכול להפיק חיבור שלם בלחיצת כפתור, מטלות הכתיבה המסורתיות מאבדות את ערכן כעדות ללמידה. השנייה נוגעת לאיכות התוכן, שכן הכלי מפיק לעיתים מידע שגוי או מוטה בביטחון מלא, והלומד נדרש ליכולת שיפוט כדי לזהות זאת. השלישית היא הצורך לעצב מחדש את משימות הלמידה עצמן. המסקנה העולה מהניתוח היא שאיסור גורף אינו מעשי ואף אינו רצוי, ונדרשת היערכות פדגוגית יצירתית שתלמד את התלמידים שימוש מושכל בכלי (מישר-טל, 2023).</w:t>
+      </w:r>
+    </w:p>
+    <w:p>
+      <w:pPr>
+        <w:bidi/>
+        <w:spacing w:after="0" w:line="480" w:lineRule="auto"/>
+        <w:jc w:val="start"/>
+      </w:pPr>
+      <w:r>
+        <w:rPr>
+          <w:rFonts w:ascii="Times New Roman" w:cs="David" w:hAnsi="Times New Roman"/>
+          <w:b w:val="false"/>
+          <w:bCs w:val="false"/>
+          <w:i w:val="false"/>
+          <w:iCs w:val="false"/>
+          <w:sz w:val="24"/>
+          <w:szCs w:val="24"/>
+          <w:rtl/>
+        </w:rPr>
+        <w:t xml:space="preserve">מחקרים על לומדים מציירים תמונה דו-ערכית. סקר בקרב 399 סטודנטים בהונג קונג מצא עמדות חיוביות בסך הכול: הסטודנטים העריכו את התמיכה הלימודית המותאמת אישית, את העזרה בכתיבה ובסיעור מוחות ואת הזמינות המתמדת של הכלי. לצד זאת הביעו חששות מדיוק המידע, מפרטיות, מסוגיות אתיות ומהאפשרות שהישענות על הכלי תפגע בהתפתחותם האישית ובעתידם המקצועי. החוקרים מדגישים שהסטודנטים אינם מבקשים איסור אלא הכוונה: מדיניות ברורה והנחיה כיצד להשתמש בכלי באופן התורם ללמידה (Chan &amp; Hu, 2023).</w:t>
+      </w:r>
+    </w:p>
+    <w:p>
+      <w:pPr>
+        <w:bidi/>
+        <w:spacing w:after="0" w:line="480" w:lineRule="auto"/>
+        <w:jc w:val="start"/>
+      </w:pPr>
+      <w:r>
+        <w:rPr>
+          <w:rFonts w:ascii="Times New Roman" w:cs="David" w:hAnsi="Times New Roman"/>
+          <w:b w:val="false"/>
+          <w:bCs w:val="false"/>
+          <w:i w:val="false"/>
+          <w:iCs w:val="false"/>
+          <w:sz w:val="24"/>
+          <w:szCs w:val="24"/>
+          <w:rtl/>
+        </w:rPr>
+        <w:t xml:space="preserve">מנגנוני האימוץ של הכלי נבחנו גם הם. מחקר איכותני שראיין 32 משתמשים בחן את גורמי השימוש ב-ChatGPT דרך עדשת התאוריה המאוחדת של קבלת טכנולוגיה, ומצא שלצד ציפיות הביצוע, ציפיות המאמץ, ההשפעה החברתית והתנאים המאפשרים פועלים שני גורמים ייחודיים לכלי שיחני: תחושת האינטראקטיביות, המדמה שיח עם בן אדם, וחששות פרטיות הנלווים לה. תחושת השיח האנושי מסבירה חלק ניכר מכוח המשיכה של הכלי, ובה בעת מעוררת את החששות ממנו (Menon &amp; Shilpa, 2023).</w:t>
+      </w:r>
+    </w:p>
+    <w:p>
+      <w:pPr>
+        <w:bidi/>
+        <w:spacing w:after="0" w:line="480" w:lineRule="auto"/>
+        <w:jc w:val="start"/>
+      </w:pPr>
+      <w:r>
+        <w:rPr>
+          <w:rFonts w:ascii="Times New Roman" w:cs="David" w:hAnsi="Times New Roman"/>
+          <w:b w:val="false"/>
+          <w:bCs w:val="false"/>
+          <w:i w:val="false"/>
+          <w:iCs w:val="false"/>
+          <w:sz w:val="24"/>
+          <w:szCs w:val="24"/>
+          <w:rtl/>
+        </w:rPr>
+        <w:t xml:space="preserve">בשדה הישראלי מצטברות עדויות ראשונות מבתי הספר עצמם. בבתי ספר יסודיים נמצא ששימוש מונחה של מורים בכלים יוצרים שינה את אופן תכנון השיעורים, העשיר את חומרי ההוראה וקידם מיומנויות דיגיטליות בכיתה (לוי-נדב ואחרים, 2024). בחינוך העל-יסודי זוהו שישה סוגי פעילויות ראשוניות שמורים מבצעים עם תלמידיהם, החל בהיכרות מודרכת עם הכלים ודיון ביקורתי בתוצריהם, דרך שימוש משותף לצורכי חקר, ועד עבודה יצירתית עצמאית של התלמידים (לוי-נדב ואחרים, 2025). מחקר פעולה שליווה הטמעה מבוקרת בבית ספר יסודי תיאר שינוי עמוק עוד יותר: תפקיד המורה נע ממעביר ידע אל מנחה דיאלוגי ושותף לחקר, והחוקרות ממליצות על שילוב מבוקר ומפוקח במקום הימנעות (וילדר ממן וזייפרט, 2026).</w:t>
+      </w:r>
+    </w:p>
+    <w:p>
+      <w:pPr>
+        <w:bidi/>
+        <w:spacing w:after="0" w:line="480" w:lineRule="auto"/>
+        <w:jc w:val="start"/>
+      </w:pPr>
+      <w:r>
+        <w:rPr>
+          <w:rFonts w:ascii="Times New Roman" w:cs="David" w:hAnsi="Times New Roman"/>
+          <w:b w:val="false"/>
+          <w:bCs w:val="false"/>
+          <w:i w:val="false"/>
+          <w:iCs w:val="false"/>
+          <w:sz w:val="24"/>
+          <w:szCs w:val="24"/>
+          <w:rtl/>
+        </w:rPr>
+        <w:t xml:space="preserve">לצד ההזדמנויות מתחדד המתח האתי. בקרב 399 סטודנטים משישה מוסדות אקדמיים בישראל נמצא מתח בין דרישות היושרה האקדמית ובין הציפייה לרכוש שליטה בכלים הנדרשים בשוק העבודה: הסטודנטים חשים שהימנעות מהכלי פוגעת בהכנתם המקצועית, בעוד השימוש בו עלול להתפרש כהפרת כללים. החוקרים ממליצים שלא לראות במתח הזה איום בלבד אלא הזדמנות חינוכית לפיתוח מצפן אתי בהנחיית הסגל (דוידוביץ' וודמני, 2025). המלצה זו מתיישבת עם התפיסה שיושרה אקדמית אינה נתון קבוע אלא מיומנות המתפתחת לאורך הלימודים, ולכן ניתנת לטיפוח מכוון (גרוס אבינר ומאירוביץ, 2021).</w:t>
       </w:r>
     </w:p>
     <w:p>
@@ -721,47 +821,107 @@
           <w:szCs w:val="24"/>
           <w:rtl/>
         </w:rPr>
-        <w:t xml:space="preserve">כדי להבין אם מורים יאמצו כלי חדש, מקובל להיעזר במודלים של קבלת טכנולוגיה. מודל קבלת הטכנולוגיה מסביר את הכוונה להשתמש בכלי באמצעות שתי תפיסות מרכזיות, תפיסת השימושיות ותפיסת קלות השימוש, והוא יושם לאחרונה גם על שילוב בינה מלאכותית בהוראת המדעים, שם נמצאו יחס חיובי וכוונת שימוש גבוהה בקרב המורים (Al Darayseh, 2023). התאוריה המאוחדת של קבלת טכנולוגיה ושימוש בה מרחיבה מודל זה וכוללת גם השפעה חברתית ותנאים מאפשרים, והיא שימשה מסגרת לניתוח אימוץ ChatGPT בקרב משתמשים (Menon &amp; Shilpa, 2023).</w:t>
-      </w:r>
-    </w:p>
-    <w:p>
-      <w:pPr>
-        <w:bidi/>
-        <w:spacing w:after="0" w:line="480" w:lineRule="auto"/>
-        <w:jc w:val="start"/>
-      </w:pPr>
-      <w:r>
-        <w:rPr>
-          <w:rFonts w:ascii="Times New Roman" w:cs="David" w:hAnsi="Times New Roman"/>
-          <w:b w:val="false"/>
-          <w:bCs w:val="false"/>
-          <w:i w:val="false"/>
-          <w:iCs w:val="false"/>
-          <w:sz w:val="24"/>
-          <w:szCs w:val="24"/>
-          <w:rtl/>
-        </w:rPr>
-        <w:t xml:space="preserve">עמדות המורים עצמם כלפי הכלי החדש מורכבות. סקר שנערך בקרב אנשי חינוך זמן קצר לאחר השקת ChatGPT העלה תערובת של חשש, בעיקר מפגיעה ביושרה אקדמית, ושל הכרה בתועלת הוראתית אפשרית (Ogurlu &amp; Mossholder, 2023). תמונה דומה עלתה בישראל: מורים ומרצים זיהו בכלי הזדמנויות להעשרת ההוראה ולחיסכון בזמן, אך הביעו הסתייגות מאיכות התוצרים ומהשלכות השימוש על הלמידה, ועמדותיהם נמצאו גורם מפתח בנכונותם להטמיעו (צמיר לוי וזייפרט, 2024א, 2024ב).</w:t>
-      </w:r>
-    </w:p>
-    <w:p>
-      <w:pPr>
-        <w:bidi/>
-        <w:spacing w:after="0" w:line="480" w:lineRule="auto"/>
-        <w:jc w:val="start"/>
-      </w:pPr>
-      <w:r>
-        <w:rPr>
-          <w:rFonts w:ascii="Times New Roman" w:cs="David" w:hAnsi="Times New Roman"/>
-          <w:b w:val="false"/>
-          <w:bCs w:val="false"/>
-          <w:i w:val="false"/>
-          <w:iCs w:val="false"/>
-          <w:sz w:val="24"/>
-          <w:szCs w:val="24"/>
-          <w:rtl/>
-        </w:rPr>
-        <w:t xml:space="preserve">מעבר לעמדות, נבחנו גם מנבאי המוכנות ללמד את התחום. בקרב 368 מורים נמצא שהכוונה לשלב בינה מלאכותית בהוראה ניבאה על ידי תפיסת הרלוונטיות של התחום, היחס כלפיו ותחושת הביטחון של המורה ביכולתו, ואילו חרדת בינה מלאכותית לא נמצאה מנבא מובהק (Ayanwale et al., 2022). בישראל נמצא כי שימוש מושכל של מורים בכלים יוצרים מותנה בידע פדגוגי וטכנולוגי-פדגוגי מספק, ולא בהיכרות טכנית בלבד (ביבי וקורץ, 2025). המשותף לממצאים אלה הוא שהמשתנים המנבאים אימוץ אינם חיצוניים למורה אלא פנימיים: תפיסות, ידע ותחושת יכולת. מכאן עולה הצורך לבחון לעומק את המושג העומד בבסיסם, תחושת המסוגלות העצמית.</w:t>
+        <w:t xml:space="preserve">כדי להבין אם מורים יאמצו כלי חדש, מקובל להיעזר במודלים של קבלת טכנולוגיה. מודל קבלת הטכנולוגיה מסביר את הכוונה להשתמש בכלי באמצעות שתי תפיסות עיקריות: תפיסת השימושיות, כלומר האמונה שהכלי ישפר את הביצוע המקצועי, ותפיסת קלות השימוש, כלומר האמונה שההפעלה לא תדרוש מאמץ רב (Al Darayseh, 2023). התאוריה המאוחדת של קבלת טכנולוגיה ושימוש בה מרחיבה מסגרת זו ומוסיפה את ההשפעה החברתית של הסביבה המקצועית ואת התנאים המאפשרים בארגון, והיא שימשה לאחרונה לניתוח אימוץ ChatGPT בקרב משתמשים (Menon &amp; Shilpa, 2023).</w:t>
+      </w:r>
+    </w:p>
+    <w:p>
+      <w:pPr>
+        <w:bidi/>
+        <w:spacing w:after="0" w:line="480" w:lineRule="auto"/>
+        <w:jc w:val="start"/>
+      </w:pPr>
+      <w:r>
+        <w:rPr>
+          <w:rFonts w:ascii="Times New Roman" w:cs="David" w:hAnsi="Times New Roman"/>
+          <w:b w:val="false"/>
+          <w:bCs w:val="false"/>
+          <w:i w:val="false"/>
+          <w:iCs w:val="false"/>
+          <w:sz w:val="24"/>
+          <w:szCs w:val="24"/>
+          <w:rtl/>
+        </w:rPr>
+        <w:t xml:space="preserve">יישום של מודל קבלת הטכנולוגיה על שילוב בינה מלאכותית בהוראת המדעים ממחיש את כוחו. בניתוח משוואות מבניות נמצא שעמדות המורים כלפי הכלי וכוונת השימוש שלהם היו גבוהות, ושני גורמים בלטו בהסבר הכוונה: תפיסת קלות השימוש, כלומר הציפייה שההפעלה לא תכביד, ותחושת המסוגלות העצמית של המורה ביחס לכישוריו הטכנולוגיים. כבר במודל הקלאסי של קבלת טכנולוגיה מסתתרת אפוא האמונה של המורה ביכולתו שלו (Al Darayseh, 2023).</w:t>
+      </w:r>
+    </w:p>
+    <w:p>
+      <w:pPr>
+        <w:bidi/>
+        <w:spacing w:after="0" w:line="480" w:lineRule="auto"/>
+        <w:jc w:val="start"/>
+      </w:pPr>
+      <w:r>
+        <w:rPr>
+          <w:rFonts w:ascii="Times New Roman" w:cs="David" w:hAnsi="Times New Roman"/>
+          <w:b w:val="false"/>
+          <w:bCs w:val="false"/>
+          <w:i w:val="false"/>
+          <w:iCs w:val="false"/>
+          <w:sz w:val="24"/>
+          <w:szCs w:val="24"/>
+          <w:rtl/>
+        </w:rPr>
+        <w:t xml:space="preserve">עמדות אנשי החינוך כלפי הכלי החדש נבחנו כבר בשבועות הראשונים לאחר השקתו. סקר מקוון שנותח ניתוח תמטי העלה תמונה דו-ערכית מובהקת: מצד אחד חשש עמוק, בעיקר מפגיעה ביושרה האקדמית ומהעתקות, ומצד שני הכרה בפוטנציאל הוראתי, כגון סיוע בהכנת חומרים ובהתאמת הוראה לתלמידים שונים. החוקרים מציינים שרוב המשיבים טרם גיבשו עמדה יציבה, מה שמעיד על חלון הזדמנויות לעיצוב עמדות באמצעות הכשרה (Ogurlu &amp; Mossholder, 2023).</w:t>
+      </w:r>
+    </w:p>
+    <w:p>
+      <w:pPr>
+        <w:bidi/>
+        <w:spacing w:after="0" w:line="480" w:lineRule="auto"/>
+        <w:jc w:val="start"/>
+      </w:pPr>
+      <w:r>
+        <w:rPr>
+          <w:rFonts w:ascii="Times New Roman" w:cs="David" w:hAnsi="Times New Roman"/>
+          <w:b w:val="false"/>
+          <w:bCs w:val="false"/>
+          <w:i w:val="false"/>
+          <w:iCs w:val="false"/>
+          <w:sz w:val="24"/>
+          <w:szCs w:val="24"/>
+          <w:rtl/>
+        </w:rPr>
+        <w:t xml:space="preserve">תמונה דומה עלתה בישראל. במחקר שבחן עמדות של מורים ומרצים כלפי ChatGPT זיהו המשיבים הזדמנויות להעשרת ההוראה, לגיוון דרכי ההערכה ולחיסכון בזמן הכנה, אך הביעו הסתייגות מאיכות התוצרים, מחשש להישענות יתר של לומדים ומהשלכות השימוש על הלמידה עצמה. החוקרות מדגישות שעמדות המורים הן גורם מפתח בהטמעה: כלי שהמורים אינם מאמינים בו לא ייכנס לכיתות, גם אם המערכת תרכוש אותו (צמיר לוי וזייפרט, 2024א, 2024ב).</w:t>
+      </w:r>
+    </w:p>
+    <w:p>
+      <w:pPr>
+        <w:bidi/>
+        <w:spacing w:after="0" w:line="480" w:lineRule="auto"/>
+        <w:jc w:val="start"/>
+      </w:pPr>
+      <w:r>
+        <w:rPr>
+          <w:rFonts w:ascii="Times New Roman" w:cs="David" w:hAnsi="Times New Roman"/>
+          <w:b w:val="false"/>
+          <w:bCs w:val="false"/>
+          <w:i w:val="false"/>
+          <w:iCs w:val="false"/>
+          <w:sz w:val="24"/>
+          <w:szCs w:val="24"/>
+          <w:rtl/>
+        </w:rPr>
+        <w:t xml:space="preserve">מעבר לעמדות, נבחנו גם מנבאי המוכנות ללמד את התחום עצמו. בסקר שנערך בקרב 368 מורים נמצא שהכוונה לשלב בינה מלאכותית בהוראה ניבאה על ידי תפיסת הרלוונטיות של התחום לעבודתם, היחס כלפיו, תחושת הביטחון של המורה ביכולתו ותפיסת תרומתו החברתית של התחום. חרדת בינה מלאכותית, בניגוד למצופה, לא נמצאה מנבא מובהק של הכוונה. ממצא זה מרמז שהגורם המניע אימוץ אינו היעדר פחד אלא נוכחות של אמונה ביכולת (Ayanwale et al., 2022).</w:t>
+      </w:r>
+    </w:p>
+    <w:p>
+      <w:pPr>
+        <w:bidi/>
+        <w:spacing w:after="0" w:line="480" w:lineRule="auto"/>
+        <w:jc w:val="start"/>
+      </w:pPr>
+      <w:r>
+        <w:rPr>
+          <w:rFonts w:ascii="Times New Roman" w:cs="David" w:hAnsi="Times New Roman"/>
+          <w:b w:val="false"/>
+          <w:bCs w:val="false"/>
+          <w:i w:val="false"/>
+          <w:iCs w:val="false"/>
+          <w:sz w:val="24"/>
+          <w:szCs w:val="24"/>
+          <w:rtl/>
+        </w:rPr>
+        <w:t xml:space="preserve">גם צד הידע נבחן בהקשר הישראלי. מחקר שבדק את הידע הטכנולוגי-פדגוגי-תוכני של מורים בישראל בשילוב בינה מלאכותית יוצרת מצא ששימוש מושכל בכלים מותנה בידע פדגוגי מעשי ותאורטי מספק, ולא בהיכרות טכנית בלבד: מורה שיודע להפעיל את הכלי אך אינו יודע לרתום אותו למטרה לימודית יפיק ממנו מעט (ביבי וקורץ, 2025). המשותף לממצאי הפרק הוא שהמשתנים המנבאים אימוץ אינם חיצוניים למורה אלא פנימיים: תפיסות, ידע ותחושת יכולת. מכאן עולה הצורך לבחון לעומק את המושג העומד בבסיס כולם, תחושת המסוגלות העצמית.</w:t>
       </w:r>
     </w:p>
     <w:p>
@@ -801,67 +961,107 @@
           <w:szCs w:val="24"/>
           <w:rtl/>
         </w:rPr>
-        <w:t xml:space="preserve">תחושת מסוגלות עצמית היא אמונתו של אדם ביכולתו לארגן ולבצע את הפעולות הנדרשות להשגת תוצאה רצויה, מושג שטבע בנדורה בתאוריה החברתית-קוגניטיבית שלו (בנדורה, 1977, כפי שמצוטט אצל קס ופרידמן, 2005). אצל מורים מקבלת האמונה הזו לבוש מקצועי: הערכת המורה את יכולתו ללמד, לנהל כיתה ולקדם תלמידים. מחקר איכותני שבחן כיצד נבנית תחושת המסוגלות של מורות מצא שהיא נשענת לא רק על התנסויות בעבודה אלא גם על מקורות מוקדמים ורחבים יותר, ובהם הבית שבו גדלה המורה והמשפחה שהקימה (קס ופרידמן, 2005).</w:t>
-      </w:r>
-    </w:p>
-    <w:p>
-      <w:pPr>
-        <w:bidi/>
-        <w:spacing w:after="0" w:line="480" w:lineRule="auto"/>
-        <w:jc w:val="start"/>
-      </w:pPr>
-      <w:r>
-        <w:rPr>
-          <w:rFonts w:ascii="Times New Roman" w:cs="David" w:hAnsi="Times New Roman"/>
-          <w:b w:val="false"/>
-          <w:bCs w:val="false"/>
-          <w:i w:val="false"/>
-          <w:iCs w:val="false"/>
-          <w:sz w:val="24"/>
-          <w:szCs w:val="24"/>
-          <w:rtl/>
-        </w:rPr>
-        <w:t xml:space="preserve">תחושת המסוגלות רגישה במיוחד בשלבי הכניסה למקצוע. בקרב 584 מורים מתחילים נמצאה תחושת מוכנות בינונית בלבד להוראה, והמסוגלות המקצועית זוהתה כגורם מרכזי בעיצובה (ארביב-אלישיב ורוזנברג, 2022). השוואה בין שני מודלים של ליווי גננות מתחילות חיזקה מסקנה זו מכיוון אחר: משתתפות שלוו במסגרת תומכת ואינטנסיבית תפסו את השתלבותן ואת מסוגלותן המקצועית באופן חיובי יותר מעמיתותיהן. הסביבה המקצועית מסוגלת אפוא לטפח את תחושת המסוגלות או לשחוק אותה (רוזנברג ואחרים, 2022).</w:t>
-      </w:r>
-    </w:p>
-    <w:p>
-      <w:pPr>
-        <w:bidi/>
-        <w:spacing w:after="0" w:line="480" w:lineRule="auto"/>
-        <w:jc w:val="start"/>
-      </w:pPr>
-      <w:r>
-        <w:rPr>
-          <w:rFonts w:ascii="Times New Roman" w:cs="David" w:hAnsi="Times New Roman"/>
-          <w:b w:val="false"/>
-          <w:bCs w:val="false"/>
-          <w:i w:val="false"/>
-          <w:iCs w:val="false"/>
-          <w:sz w:val="24"/>
-          <w:szCs w:val="24"/>
-          <w:rtl/>
-        </w:rPr>
-        <w:t xml:space="preserve">שחיקה כזו אינה עניין תאורטי. מיפוי גורמי הלחץ בעבודת מורים בישראל העלה עומס משימות, ריבוי גורמים מולם נדרש המורה לפעול ותחושת היעדר שליטה (בוסקילה וחן-לוי, 2020). מחקרים שנערכו בתקופת מלחמת חרבות ברזל הראו עד כמה משאבים פנימיים וחיצוניים מגינים על אנשי חינוך בעת משבר: הון פסיכולוגי ותמיכה חברתית נמצאו קשורים לעלייה במסוגלות התעסוקתית של יועצים חינוכיים ולירידה בדחק (אלון, רובין ורוזנטל, 2025; אלון, רוזנטל ואחרים, 2025). ראיונות עם אנשי הוראה ששבו משירות מילואים תיארו פגיעה ממשית בתחושת התפקוד המקצועי (כהן זדה, 2025).</w:t>
-      </w:r>
-    </w:p>
-    <w:p>
-      <w:pPr>
-        <w:bidi/>
-        <w:spacing w:after="0" w:line="480" w:lineRule="auto"/>
-        <w:jc w:val="start"/>
-      </w:pPr>
-      <w:r>
-        <w:rPr>
-          <w:rFonts w:ascii="Times New Roman" w:cs="David" w:hAnsi="Times New Roman"/>
-          <w:b w:val="false"/>
-          <w:bCs w:val="false"/>
-          <w:i w:val="false"/>
-          <w:iCs w:val="false"/>
-          <w:sz w:val="24"/>
-          <w:szCs w:val="24"/>
-          <w:rtl/>
-        </w:rPr>
-        <w:t xml:space="preserve">לענייננו חשובה במיוחד הזיקה שבין מסוגלות לטכנולוגיה. בקרב 1,158 מורים בנורווגיה נמצא שתחושת מסוגלות בשימוש בטכנולוגיות מידע לצרכים פדגוגיים, יחד עם שיתוף פעולה קולגיאלי, קשורה לשימוש בפועל בטכנולוגיה בהוראה. כלומר, האמונה ביכולת אינה רק תוצר של השימוש אלא גם תנאי לו, ומתקבל מעגל שבו מסוגלות מזינה שימוש והשימוש מזין מסוגלות (Hatlevik &amp; Hatlevik, 2018).</w:t>
+        <w:t xml:space="preserve">תחושת מסוגלות עצמית היא אמונתו של אדם ביכולתו לארגן ולבצע את הפעולות הנדרשות להשגת תוצאה רצויה, מושג שטבע בנדורה בתאוריה החברתית-קוגניטיבית שלו. על פי התאוריה, האמונה הזו אינה שיקוף פשוט של היכולת בפועל: שני אנשים בעלי כישורים דומים עשויים לתפקד באופן שונה לחלוטין בהתאם לאמונתם ביכולתם, שכן תחושת המסוגלות משפיעה על הצבת מטרות, על השקעת מאמץ ועל התמדה מול קושי (בנדורה, 1977, כפי שמצוטט אצל קס ופרידמן, 2005).</w:t>
+      </w:r>
+    </w:p>
+    <w:p>
+      <w:pPr>
+        <w:bidi/>
+        <w:spacing w:after="0" w:line="480" w:lineRule="auto"/>
+        <w:jc w:val="start"/>
+      </w:pPr>
+      <w:r>
+        <w:rPr>
+          <w:rFonts w:ascii="Times New Roman" w:cs="David" w:hAnsi="Times New Roman"/>
+          <w:b w:val="false"/>
+          <w:bCs w:val="false"/>
+          <w:i w:val="false"/>
+          <w:iCs w:val="false"/>
+          <w:sz w:val="24"/>
+          <w:szCs w:val="24"/>
+          <w:rtl/>
+        </w:rPr>
+        <w:t xml:space="preserve">אצל מורים מקבלת האמונה הזו לבוש מקצועי: הערכת המורה את יכולתו ללמד, לנהל כיתה, להתמודד עם קשיי משמעת ולקדם תלמידים מתקשים. מחקר איכותני שבחן כיצד נבנית תחושת המסוגלות של מורות, מנקודת מבטן שלהן, מצא שהיא נשענת לא רק על התנסויות בעבודה אלא גם על מקורות מוקדמים ורחבים בהרבה, ובהם הבית שבו גדלה המורה, הדמויות המשמעותיות בילדותה והמשפחה שהקימה. המחברות מכנות זאת מעבר בין המשפחה הפרטית למשפחה המקצועית, ומדגישות שגורמים מעכבים ומקדמים פועלים בשני המרחבים גם יחד (קס ופרידמן, 2005).</w:t>
+      </w:r>
+    </w:p>
+    <w:p>
+      <w:pPr>
+        <w:bidi/>
+        <w:spacing w:after="0" w:line="480" w:lineRule="auto"/>
+        <w:jc w:val="start"/>
+      </w:pPr>
+      <w:r>
+        <w:rPr>
+          <w:rFonts w:ascii="Times New Roman" w:cs="David" w:hAnsi="Times New Roman"/>
+          <w:b w:val="false"/>
+          <w:bCs w:val="false"/>
+          <w:i w:val="false"/>
+          <w:iCs w:val="false"/>
+          <w:sz w:val="24"/>
+          <w:szCs w:val="24"/>
+          <w:rtl/>
+        </w:rPr>
+        <w:t xml:space="preserve">תחושת המסוגלות רגישה במיוחד בשלבי הכניסה למקצוע. בסקר שנערך בקרב 584 מורים מתחילים נמצאה תחושת מוכנות בינונית בלבד להוראה בכניסה לתפקיד, והמסוגלות המקצועית זוהתה כגורם מוביל בעיצוב תחושת המוכנות: מורה מתחיל המאמין ביכולתו חש מוכן יותר להתמודד עם הכיתה, גם כשהידע שלו עדיין חלקי (ארביב-אלישיב ורוזנברג, 2022). השוואה בין שני מודלים של ליווי גננות מתחילות מחמש מכללות חיזקה מסקנה זו מכיוון אחר: גננות שלוו במסגרת חממה תומכת ואינטנסיבית תפסו את השתלבותן המקצועית ואת מסוגלותן באופן חיובי יותר מעמיתותיהן שהשתתפו בסדנת ליווי רגילה. הסביבה המקצועית מסוגלת אפוא לטפח את תחושת המסוגלות או להחמיץ את ההזדמנות לעשות זאת (רוזנברג ואחרים, 2022).</w:t>
+      </w:r>
+    </w:p>
+    <w:p>
+      <w:pPr>
+        <w:bidi/>
+        <w:spacing w:after="0" w:line="480" w:lineRule="auto"/>
+        <w:jc w:val="start"/>
+      </w:pPr>
+      <w:r>
+        <w:rPr>
+          <w:rFonts w:ascii="Times New Roman" w:cs="David" w:hAnsi="Times New Roman"/>
+          <w:b w:val="false"/>
+          <w:bCs w:val="false"/>
+          <w:i w:val="false"/>
+          <w:iCs w:val="false"/>
+          <w:sz w:val="24"/>
+          <w:szCs w:val="24"/>
+          <w:rtl/>
+        </w:rPr>
+        <w:t xml:space="preserve">מנגד פועלים כוחות שוחקים. מיפוי גורמי הלחץ בעבודת מורים בבתי ספר יסודיים, בחטיבות ביניים ובתיכונים בישראל העלה רשימה ארוכה: עומס משימות, ריבוי גורמים שמולם נדרש המורה לפעול בו זמנית, הורים, הנהלה ותלמידים, ותחושת היעדר שליטה על תנאי העבודה. לחץ מתמשך מסוג זה הוא הרקע שעליו נבחנת יציבותה של תחושת המסוגלות המקצועית (בוסקילה וחן-לוי, 2020).</w:t>
+      </w:r>
+    </w:p>
+    <w:p>
+      <w:pPr>
+        <w:bidi/>
+        <w:spacing w:after="0" w:line="480" w:lineRule="auto"/>
+        <w:jc w:val="start"/>
+      </w:pPr>
+      <w:r>
+        <w:rPr>
+          <w:rFonts w:ascii="Times New Roman" w:cs="David" w:hAnsi="Times New Roman"/>
+          <w:b w:val="false"/>
+          <w:bCs w:val="false"/>
+          <w:i w:val="false"/>
+          <w:iCs w:val="false"/>
+          <w:sz w:val="24"/>
+          <w:szCs w:val="24"/>
+          <w:rtl/>
+        </w:rPr>
+        <w:t xml:space="preserve">מחקרים שנערכו בתקופת מלחמת חרבות ברזל המחישו עד כמה משאבים פנימיים וחיצוניים מגינים על אנשי חינוך בעת משבר. בקרב יועצים חינוכיים נמצא שהון פסיכולוגי, הכולל אופטימיות, תקווה ותחושת מסוגלות, יחד עם תמיכה חברתית, קשור לעלייה במסוגלות התעסוקתית ולירידה ברמות הדחק (אלון, רובין ורוזנטל, 2025; אלון, רוזנטל ואחרים, 2025). ראיונות עומק עם אנשי הוראה ששבו לבתי הספר משירות מילואים ממושך תיארו את הצד השני של המטבע: קשיי הסתגלות ופגיעה ממשית בתחושת התפקוד המקצועי (כהן זדה, 2025).</w:t>
+      </w:r>
+    </w:p>
+    <w:p>
+      <w:pPr>
+        <w:bidi/>
+        <w:spacing w:after="0" w:line="480" w:lineRule="auto"/>
+        <w:jc w:val="start"/>
+      </w:pPr>
+      <w:r>
+        <w:rPr>
+          <w:rFonts w:ascii="Times New Roman" w:cs="David" w:hAnsi="Times New Roman"/>
+          <w:b w:val="false"/>
+          <w:bCs w:val="false"/>
+          <w:i w:val="false"/>
+          <w:iCs w:val="false"/>
+          <w:sz w:val="24"/>
+          <w:szCs w:val="24"/>
+          <w:rtl/>
+        </w:rPr>
+        <w:t xml:space="preserve">לענייננו חשובה במיוחד הזיקה שבין מסוגלות לטכנולוגיה. בסקר רחב היקף שנערך בקרב 1,158 מורים בנורווגיה נמצא שתחושת מסוגלות בשימוש בטכנולוגיות מידע לצרכים פדגוגיים, יחד עם שיתוף פעולה קולגיאלי סביב הטכנולוגיה, קשורה לשימוש בפועל בטכנולוגיה בהוראה. האמונה ביכולת אינה רק תוצר של השימוש אלא גם תנאי לו, ומתקבל מעגל שבו מסוגלות מזינה שימוש והשימוש מזין מסוגלות. מעגל זה הוא נקודת המוצא לשאלה שבמוקד המחקר הנוכחי: מה קורה לו כאשר הטכנולוגיה שבמרכזו היא בינה מלאכותית יוצרת (Hatlevik &amp; Hatlevik, 2018).</w:t>
       </w:r>
     </w:p>
     <w:p>
@@ -901,47 +1101,87 @@
           <w:szCs w:val="24"/>
           <w:rtl/>
         </w:rPr>
-        <w:t xml:space="preserve">חיבור הגופים שנסקרו עד כה מעלה שאלה שטרם הוכרעה: כיצד משפיע השימוש בכלי בינה מלאכותית יוצרת על תחושת המסוגלות המקצועית של המורה? מצד אחד, הכלי עשוי לספק חוויות הצלחה, לחסוך זמן הכנה ולהרחיב את רפרטואר ההוראה, ובכך לחזק את האמונה ביכולת. תמיכה בכיוון זה עולה מממצאים שלפיהם תחושת ביטחון ביכולת מנבאת כוונת שימוש ועמדות חיוביות כלפי הכלי (Al Darayseh, 2023; Ayanwale et al., 2022).</w:t>
-      </w:r>
-    </w:p>
-    <w:p>
-      <w:pPr>
-        <w:bidi/>
-        <w:spacing w:after="0" w:line="480" w:lineRule="auto"/>
-        <w:jc w:val="start"/>
-      </w:pPr>
-      <w:r>
-        <w:rPr>
-          <w:rFonts w:ascii="Times New Roman" w:cs="David" w:hAnsi="Times New Roman"/>
-          <w:b w:val="false"/>
-          <w:bCs w:val="false"/>
-          <w:i w:val="false"/>
-          <w:iCs w:val="false"/>
-          <w:sz w:val="24"/>
-          <w:szCs w:val="24"/>
-          <w:rtl/>
-        </w:rPr>
-        <w:t xml:space="preserve">מצד שני, מתועדים גם כיוונים הפוכים. בקרב פרחי הוראה נמצא שחרדת בינה מלאכותית יוצרת ניבאה את הכוונה לתכנן הוראה בעזרת הכלי, ותחושת המסוגלות הטכנולוגית השתלבה במערך הקשרים המורכב שבין ידע, חרדה וכוונה (Wang et al., 2024). בישראל התקבל ממצא מפתיע עוד יותר: מורים שהשתמשו בבינה מלאכותית להכנת חומרי הוראה דיווחו דווקא על עלייה בתחושת העומס והשחיקה, ככל הנראה בשל עלות הלמידה של כלים המשתנים תדיר ללא הכשרה מספקת (אטיאס ואחרים, 2026).</w:t>
-      </w:r>
-    </w:p>
-    <w:p>
-      <w:pPr>
-        <w:bidi/>
-        <w:spacing w:after="0" w:line="480" w:lineRule="auto"/>
-        <w:jc w:val="start"/>
-      </w:pPr>
-      <w:r>
-        <w:rPr>
-          <w:rFonts w:ascii="Times New Roman" w:cs="David" w:hAnsi="Times New Roman"/>
-          <w:b w:val="false"/>
-          <w:bCs w:val="false"/>
-          <w:i w:val="false"/>
-          <w:iCs w:val="false"/>
-          <w:sz w:val="24"/>
-          <w:szCs w:val="24"/>
-          <w:rtl/>
-        </w:rPr>
-        <w:t xml:space="preserve">ותק ההוראה עשוי להסביר חלק מהסתירה הזו. הספרות שנסקרה מלמדת שתחושת המסוגלות של מורים מתחילים שברירית ומעוצבת על ידי הסביבה, בעוד מורים ותיקים נשענים על ניסיון מצטבר (ארביב-אלישיב ורוזנברג, 2022; רוזנברג ואחרים, 2022), ושהניסיון הקודם עם טכנולוגיה מעצב את היחס אליה (כהן וליברמן, 2025). סביר אפוא שהקשר בין שימוש בבינה מלאכותית יוצרת לבין מסוגלות מקצועית לא יהיה אחיד לאורך הקריירה, ואולם השערה זו טרם נבחנה ישירות. רוב המחקר הקיים עוסק בעמדות ובכוונות שימוש ולא במסוגלות המקצועית עצמה, וחלקו נערך בקרב פרחי הוראה או סטודנטים ולא בקרב מורים פעילים (Chan &amp; Hu, 2023; Wang et al., 2024).</w:t>
+        <w:t xml:space="preserve">חיבור הגופים שנסקרו עד כה מעלה שאלה שטרם הוכרעה: כיצד משפיע השימוש בכלי בינה מלאכותית יוצרת על תחושת המסוגלות המקצועית של המורה? מצד אחד, הכלי עשוי לפעול כמשאב מעצים. הוא מספק למורה חוויות הצלחה מהירות בהכנת חומרים, חוסך זמן עבודה ומרחיב את רפרטואר ההוראה, וכל אלה הם בדיוק סוג ההתנסויות שמהן נבנית תחושת מסוגלות. תמיכה עקיפה בכיוון זה עולה מממצאים שלפיהם תחושת ביטחון ביכולת ומסוגלות טכנולוגית מנבאות עמדות חיוביות וכוונת שימוש בכלי (Al Darayseh, 2023; Ayanwale et al., 2022).</w:t>
+      </w:r>
+    </w:p>
+    <w:p>
+      <w:pPr>
+        <w:bidi/>
+        <w:spacing w:after="0" w:line="480" w:lineRule="auto"/>
+        <w:jc w:val="start"/>
+      </w:pPr>
+      <w:r>
+        <w:rPr>
+          <w:rFonts w:ascii="Times New Roman" w:cs="David" w:hAnsi="Times New Roman"/>
+          <w:b w:val="false"/>
+          <w:bCs w:val="false"/>
+          <w:i w:val="false"/>
+          <w:iCs w:val="false"/>
+          <w:sz w:val="24"/>
+          <w:szCs w:val="24"/>
+          <w:rtl/>
+        </w:rPr>
+        <w:t xml:space="preserve">מצד שני, מתועדים גם כיוונים מורכבים יותר. במחקר שנערך בקרב 606 פרחי הוראה נבחנו במודל משוואות מבניות הקשרים שבין חרדת בינה מלאכותית יוצרת, מסוגלות טכנולוגית, ידע טכנולוגי-פדגוגי-תוכני וכוונה לתכנן הוראה בעזרת הכלי. חרדת הבינה המלאכותית, ההשפעה החברתית וציפיות הביצוע נמצאו מנבאים מובהקים של הכוונה, ואילו ציפיות המאמץ והתנאים המאפשרים לא נמצאו כאלה. תחושת המסוגלות הטכנולוגית השתלבה במערך הקשרים כולו, מה שמלמד שהיחסים בין רגש, אמונה ביכולת וכוונה רחוקים מלהיות פשוטים (Wang et al., 2024).</w:t>
+      </w:r>
+    </w:p>
+    <w:p>
+      <w:pPr>
+        <w:bidi/>
+        <w:spacing w:after="0" w:line="480" w:lineRule="auto"/>
+        <w:jc w:val="start"/>
+      </w:pPr>
+      <w:r>
+        <w:rPr>
+          <w:rFonts w:ascii="Times New Roman" w:cs="David" w:hAnsi="Times New Roman"/>
+          <w:b w:val="false"/>
+          <w:bCs w:val="false"/>
+          <w:i w:val="false"/>
+          <w:iCs w:val="false"/>
+          <w:sz w:val="24"/>
+          <w:szCs w:val="24"/>
+          <w:rtl/>
+        </w:rPr>
+        <w:t xml:space="preserve">בישראל התקבל ממצא מפתיע עוד יותר. במחקר שבחן את הקשר בין שימוש בבינה מלאכותית לבין שחיקה ועומס בעבודת המורה, מורים שהשתמשו בכלים להכנת חומרי הוראה דיווחו דווקא על עלייה בתחושת העומס והשחיקה, בניגוד להשערת החוקרים. ההסבר המוצע הוא עלות הלמידה: הכלים משתנים בקצב מהיר, ההכשרה אינה מדביקה את הקצב, והמורה נדרש להשקיע שעות בלמידה עצמית לצד עבודתו השוטפת. לצד זאת נמצא שפתיחות לשינוי קשורה בקשר שלילי לשחיקה, כלומר מאפיינים אישיים ממתנים את המחיר שהטכנולוגיה גובה (אטיאס ואחרים, 2026).</w:t>
+      </w:r>
+    </w:p>
+    <w:p>
+      <w:pPr>
+        <w:bidi/>
+        <w:spacing w:after="0" w:line="480" w:lineRule="auto"/>
+        <w:jc w:val="start"/>
+      </w:pPr>
+      <w:r>
+        <w:rPr>
+          <w:rFonts w:ascii="Times New Roman" w:cs="David" w:hAnsi="Times New Roman"/>
+          <w:b w:val="false"/>
+          <w:bCs w:val="false"/>
+          <w:i w:val="false"/>
+          <w:iCs w:val="false"/>
+          <w:sz w:val="24"/>
+          <w:szCs w:val="24"/>
+          <w:rtl/>
+        </w:rPr>
+        <w:t xml:space="preserve">שני הכיוונים המנוגדים האלה, העצמה מזה ושחיקה מזה, מרמזים שהקשר בין שימוש בבינה מלאכותית יוצרת לבין מסוגלות מקצועית אינו אחיד, ושמשתנים ממתנים פועלים בו. ותק ההוראה הוא מועמד טבעי לתפקיד זה. הספרות שנסקרה מלמדת שתחושת המסוגלות של מורים מתחילים שברירית ומעוצבת במידה רבה על ידי הסביבה המלווה (ארביב-אלישיב ורוזנברג, 2022; רוזנברג ואחרים, 2022), ושניסיון קודם עם טכנולוגיה מעצב את היחס אליה (כהן וליברמן, 2025). אפשר לשער שמורה מתחיל, שמסוגלותו עדיין מתגבשת, יושפע מהכלי באופן שונה ממורה ותיק שאמונתו ביכולתו נשענת על שנים של התנסויות, אך השערה זו טרם נבחנה ישירות.</w:t>
+      </w:r>
+    </w:p>
+    <w:p>
+      <w:pPr>
+        <w:bidi/>
+        <w:spacing w:after="0" w:line="480" w:lineRule="auto"/>
+        <w:jc w:val="start"/>
+      </w:pPr>
+      <w:r>
+        <w:rPr>
+          <w:rFonts w:ascii="Times New Roman" w:cs="David" w:hAnsi="Times New Roman"/>
+          <w:b w:val="false"/>
+          <w:bCs w:val="false"/>
+          <w:i w:val="false"/>
+          <w:iCs w:val="false"/>
+          <w:sz w:val="24"/>
+          <w:szCs w:val="24"/>
+          <w:rtl/>
+        </w:rPr>
+        <w:t xml:space="preserve">כאן מתבהר גם הפער המחקרי. רוב המחקר הקיים על בינה מלאכותית יוצרת בחינוך עוסק בעמדות, בתפיסות ובכוונות שימוש, ולא בתחושת המסוגלות המקצועית עצמה כמשתנה תלוי, וחלק ניכר ממנו נערך בקרב סטודנטים או פרחי הוראה ולא בקרב מורים פעילים בבתי ספר (Chan &amp; Hu, 2023; Wang et al., 2024). גם המחקר הישראלי שבחן השפעות של השימוש על עולמו הפנימי של המורה התמקד בשחיקה ובעומס ולא במסוגלות (אטיאס ואחרים, 2026).</w:t>
       </w:r>
     </w:p>
     <w:p>

</xml_diff>

<commit_message>
Add Ono logo to cover page and force absolute right alignment for RTL paragraphs
Co-Authored-By: Claude Fable 5 <noreply@anthropic.com>
Claude-Session: https://claude.ai/code/session_01AjM11GFfrxyiDV2Q3kcPRu
</commit_message>
<xml_diff>
--- a/literature-review/סקירת ספרות - בינה מלאכותית ומסוגלות עצמית של מורים.docx
+++ b/literature-review/סקירת ספרות - בינה מלאכותית ומסוגלות עצמית של מורים.docx
@@ -4,8 +4,54 @@
   <w:body>
     <w:p>
       <w:pPr>
-        <w:bidi/>
-        <w:spacing w:after="0" w:before="1200" w:line="360" w:lineRule="auto"/>
+        <w:spacing w:after="200" w:before="400"/>
+        <w:jc w:val="center"/>
+      </w:pPr>
+      <w:r>
+        <w:drawing>
+          <wp:inline distT="0" distB="0" distL="0" distR="0">
+            <wp:extent cx="1333500" cy="1333500"/>
+            <wp:effectExtent t="0" r="0" b="0" l="0"/>
+            <wp:docPr id="1" name="" descr="" title=""/>
+            <wp:cNvGraphicFramePr>
+              <a:graphicFrameLocks xmlns:a="http://schemas.openxmlformats.org/drawingml/2006/main" noChangeAspect="1"/>
+            </wp:cNvGraphicFramePr>
+            <a:graphic xmlns:a="http://schemas.openxmlformats.org/drawingml/2006/main">
+              <a:graphicData uri="http://schemas.openxmlformats.org/drawingml/2006/picture">
+                <pic:pic xmlns:pic="http://schemas.openxmlformats.org/drawingml/2006/picture">
+                  <pic:nvPicPr>
+                    <pic:cNvPr id="0" name="" descr=""/>
+                    <pic:cNvPicPr>
+                      <a:picLocks noChangeAspect="1" noChangeArrowheads="1"/>
+                    </pic:cNvPicPr>
+                  </pic:nvPicPr>
+                  <pic:blipFill>
+                    <a:blip r:embed="rId7" cstate="none"/>
+                    <a:srcRect/>
+                    <a:stretch>
+                      <a:fillRect/>
+                    </a:stretch>
+                  </pic:blipFill>
+                  <pic:spPr bwMode="auto">
+                    <a:xfrm>
+                      <a:off x="0" y="0"/>
+                      <a:ext cx="1333500" cy="1333500"/>
+                    </a:xfrm>
+                    <a:prstGeom prst="rect">
+                      <a:avLst/>
+                    </a:prstGeom>
+                  </pic:spPr>
+                </pic:pic>
+              </a:graphicData>
+            </a:graphic>
+          </wp:inline>
+        </w:drawing>
+      </w:r>
+    </w:p>
+    <w:p>
+      <w:pPr>
+        <w:bidi/>
+        <w:spacing w:after="0" w:before="200" w:line="360" w:lineRule="auto"/>
         <w:jc w:val="center"/>
       </w:pPr>
       <w:r>
@@ -187,7 +233,7 @@
         <w:pageBreakBefore/>
         <w:bidi/>
         <w:spacing w:after="120" w:line="480" w:lineRule="auto"/>
-        <w:jc w:val="start"/>
+        <w:jc w:val="right"/>
       </w:pPr>
       <w:r>
         <w:rPr>
@@ -207,7 +253,7 @@
       <w:pPr>
         <w:bidi/>
         <w:spacing w:before="120" w:line="480" w:lineRule="auto"/>
-        <w:jc w:val="start"/>
+        <w:jc w:val="right"/>
       </w:pPr>
       <w:r>
         <w:rPr>
@@ -227,7 +273,7 @@
       <w:pPr>
         <w:bidi/>
         <w:spacing w:after="0" w:line="480" w:lineRule="auto"/>
-        <w:jc w:val="start"/>
+        <w:jc w:val="right"/>
       </w:pPr>
       <w:r>
         <w:rPr>
@@ -247,7 +293,7 @@
       <w:pPr>
         <w:bidi/>
         <w:spacing w:before="120" w:line="480" w:lineRule="auto"/>
-        <w:jc w:val="start"/>
+        <w:jc w:val="right"/>
       </w:pPr>
       <w:r>
         <w:rPr>
@@ -267,7 +313,7 @@
       <w:pPr>
         <w:bidi/>
         <w:spacing w:after="0" w:line="480" w:lineRule="auto"/>
-        <w:jc w:val="start"/>
+        <w:jc w:val="right"/>
       </w:pPr>
       <w:r>
         <w:rPr>
@@ -287,7 +333,7 @@
       <w:pPr>
         <w:bidi/>
         <w:spacing w:before="120" w:line="480" w:lineRule="auto"/>
-        <w:jc w:val="start"/>
+        <w:jc w:val="right"/>
       </w:pPr>
       <w:r>
         <w:rPr>
@@ -307,7 +353,7 @@
       <w:pPr>
         <w:bidi/>
         <w:spacing w:after="0" w:line="480" w:lineRule="auto"/>
-        <w:jc w:val="start"/>
+        <w:jc w:val="right"/>
       </w:pPr>
       <w:r>
         <w:rPr>
@@ -327,7 +373,7 @@
       <w:pPr>
         <w:bidi/>
         <w:spacing w:before="120" w:line="480" w:lineRule="auto"/>
-        <w:jc w:val="start"/>
+        <w:jc w:val="right"/>
       </w:pPr>
       <w:r>
         <w:rPr>
@@ -347,7 +393,7 @@
       <w:pPr>
         <w:bidi/>
         <w:spacing w:after="0" w:line="480" w:lineRule="auto"/>
-        <w:jc w:val="start"/>
+        <w:jc w:val="right"/>
       </w:pPr>
       <w:r>
         <w:rPr>
@@ -368,7 +414,7 @@
         <w:pageBreakBefore/>
         <w:bidi/>
         <w:spacing w:after="120" w:line="480" w:lineRule="auto"/>
-        <w:jc w:val="start"/>
+        <w:jc w:val="right"/>
       </w:pPr>
       <w:r>
         <w:rPr>
@@ -388,7 +434,7 @@
       <w:pPr>
         <w:bidi/>
         <w:spacing w:after="120" w:line="480" w:lineRule="auto"/>
-        <w:jc w:val="start"/>
+        <w:jc w:val="right"/>
       </w:pPr>
       <w:r>
         <w:rPr>
@@ -408,7 +454,7 @@
       <w:pPr>
         <w:bidi/>
         <w:spacing w:before="120" w:line="480" w:lineRule="auto"/>
-        <w:jc w:val="start"/>
+        <w:jc w:val="right"/>
       </w:pPr>
       <w:r>
         <w:rPr>
@@ -428,7 +474,7 @@
       <w:pPr>
         <w:bidi/>
         <w:spacing w:after="0" w:line="480" w:lineRule="auto"/>
-        <w:jc w:val="start"/>
+        <w:jc w:val="right"/>
       </w:pPr>
       <w:r>
         <w:rPr>
@@ -448,7 +494,7 @@
       <w:pPr>
         <w:bidi/>
         <w:spacing w:after="0" w:line="480" w:lineRule="auto"/>
-        <w:jc w:val="start"/>
+        <w:jc w:val="right"/>
       </w:pPr>
       <w:r>
         <w:rPr>
@@ -468,7 +514,7 @@
       <w:pPr>
         <w:bidi/>
         <w:spacing w:after="0" w:line="480" w:lineRule="auto"/>
-        <w:jc w:val="start"/>
+        <w:jc w:val="right"/>
       </w:pPr>
       <w:r>
         <w:rPr>
@@ -488,7 +534,7 @@
       <w:pPr>
         <w:bidi/>
         <w:spacing w:after="0" w:line="480" w:lineRule="auto"/>
-        <w:jc w:val="start"/>
+        <w:jc w:val="right"/>
       </w:pPr>
       <w:r>
         <w:rPr>
@@ -508,7 +554,7 @@
       <w:pPr>
         <w:bidi/>
         <w:spacing w:after="0" w:line="480" w:lineRule="auto"/>
-        <w:jc w:val="start"/>
+        <w:jc w:val="right"/>
       </w:pPr>
       <w:r>
         <w:rPr>
@@ -528,7 +574,7 @@
       <w:pPr>
         <w:bidi/>
         <w:spacing w:before="120" w:line="480" w:lineRule="auto"/>
-        <w:jc w:val="start"/>
+        <w:jc w:val="right"/>
       </w:pPr>
       <w:r>
         <w:rPr>
@@ -548,7 +594,7 @@
       <w:pPr>
         <w:bidi/>
         <w:spacing w:after="0" w:line="480" w:lineRule="auto"/>
-        <w:jc w:val="start"/>
+        <w:jc w:val="right"/>
       </w:pPr>
       <w:r>
         <w:rPr>
@@ -568,7 +614,7 @@
       <w:pPr>
         <w:bidi/>
         <w:spacing w:after="0" w:line="480" w:lineRule="auto"/>
-        <w:jc w:val="start"/>
+        <w:jc w:val="right"/>
       </w:pPr>
       <w:r>
         <w:rPr>
@@ -588,7 +634,7 @@
       <w:pPr>
         <w:bidi/>
         <w:spacing w:after="0" w:line="480" w:lineRule="auto"/>
-        <w:jc w:val="start"/>
+        <w:jc w:val="right"/>
       </w:pPr>
       <w:r>
         <w:rPr>
@@ -608,7 +654,7 @@
       <w:pPr>
         <w:bidi/>
         <w:spacing w:after="0" w:line="480" w:lineRule="auto"/>
-        <w:jc w:val="start"/>
+        <w:jc w:val="right"/>
       </w:pPr>
       <w:r>
         <w:rPr>
@@ -628,7 +674,7 @@
       <w:pPr>
         <w:bidi/>
         <w:spacing w:after="0" w:line="480" w:lineRule="auto"/>
-        <w:jc w:val="start"/>
+        <w:jc w:val="right"/>
       </w:pPr>
       <w:r>
         <w:rPr>
@@ -648,7 +694,7 @@
       <w:pPr>
         <w:bidi/>
         <w:spacing w:before="120" w:line="480" w:lineRule="auto"/>
-        <w:jc w:val="start"/>
+        <w:jc w:val="right"/>
       </w:pPr>
       <w:r>
         <w:rPr>
@@ -668,7 +714,7 @@
       <w:pPr>
         <w:bidi/>
         <w:spacing w:after="0" w:line="480" w:lineRule="auto"/>
-        <w:jc w:val="start"/>
+        <w:jc w:val="right"/>
       </w:pPr>
       <w:r>
         <w:rPr>
@@ -688,7 +734,7 @@
       <w:pPr>
         <w:bidi/>
         <w:spacing w:after="0" w:line="480" w:lineRule="auto"/>
-        <w:jc w:val="start"/>
+        <w:jc w:val="right"/>
       </w:pPr>
       <w:r>
         <w:rPr>
@@ -708,7 +754,7 @@
       <w:pPr>
         <w:bidi/>
         <w:spacing w:after="0" w:line="480" w:lineRule="auto"/>
-        <w:jc w:val="start"/>
+        <w:jc w:val="right"/>
       </w:pPr>
       <w:r>
         <w:rPr>
@@ -728,7 +774,7 @@
       <w:pPr>
         <w:bidi/>
         <w:spacing w:after="0" w:line="480" w:lineRule="auto"/>
-        <w:jc w:val="start"/>
+        <w:jc w:val="right"/>
       </w:pPr>
       <w:r>
         <w:rPr>
@@ -748,7 +794,7 @@
       <w:pPr>
         <w:bidi/>
         <w:spacing w:after="0" w:line="480" w:lineRule="auto"/>
-        <w:jc w:val="start"/>
+        <w:jc w:val="right"/>
       </w:pPr>
       <w:r>
         <w:rPr>
@@ -768,7 +814,7 @@
       <w:pPr>
         <w:bidi/>
         <w:spacing w:after="0" w:line="480" w:lineRule="auto"/>
-        <w:jc w:val="start"/>
+        <w:jc w:val="right"/>
       </w:pPr>
       <w:r>
         <w:rPr>
@@ -788,7 +834,7 @@
       <w:pPr>
         <w:bidi/>
         <w:spacing w:before="120" w:line="480" w:lineRule="auto"/>
-        <w:jc w:val="start"/>
+        <w:jc w:val="right"/>
       </w:pPr>
       <w:r>
         <w:rPr>
@@ -808,7 +854,7 @@
       <w:pPr>
         <w:bidi/>
         <w:spacing w:after="0" w:line="480" w:lineRule="auto"/>
-        <w:jc w:val="start"/>
+        <w:jc w:val="right"/>
       </w:pPr>
       <w:r>
         <w:rPr>
@@ -828,7 +874,7 @@
       <w:pPr>
         <w:bidi/>
         <w:spacing w:after="0" w:line="480" w:lineRule="auto"/>
-        <w:jc w:val="start"/>
+        <w:jc w:val="right"/>
       </w:pPr>
       <w:r>
         <w:rPr>
@@ -848,7 +894,7 @@
       <w:pPr>
         <w:bidi/>
         <w:spacing w:after="0" w:line="480" w:lineRule="auto"/>
-        <w:jc w:val="start"/>
+        <w:jc w:val="right"/>
       </w:pPr>
       <w:r>
         <w:rPr>
@@ -868,7 +914,7 @@
       <w:pPr>
         <w:bidi/>
         <w:spacing w:after="0" w:line="480" w:lineRule="auto"/>
-        <w:jc w:val="start"/>
+        <w:jc w:val="right"/>
       </w:pPr>
       <w:r>
         <w:rPr>
@@ -888,7 +934,7 @@
       <w:pPr>
         <w:bidi/>
         <w:spacing w:after="0" w:line="480" w:lineRule="auto"/>
-        <w:jc w:val="start"/>
+        <w:jc w:val="right"/>
       </w:pPr>
       <w:r>
         <w:rPr>
@@ -908,7 +954,7 @@
       <w:pPr>
         <w:bidi/>
         <w:spacing w:after="0" w:line="480" w:lineRule="auto"/>
-        <w:jc w:val="start"/>
+        <w:jc w:val="right"/>
       </w:pPr>
       <w:r>
         <w:rPr>
@@ -928,7 +974,7 @@
       <w:pPr>
         <w:bidi/>
         <w:spacing w:before="120" w:line="480" w:lineRule="auto"/>
-        <w:jc w:val="start"/>
+        <w:jc w:val="right"/>
       </w:pPr>
       <w:r>
         <w:rPr>
@@ -948,7 +994,7 @@
       <w:pPr>
         <w:bidi/>
         <w:spacing w:after="0" w:line="480" w:lineRule="auto"/>
-        <w:jc w:val="start"/>
+        <w:jc w:val="right"/>
       </w:pPr>
       <w:r>
         <w:rPr>
@@ -968,7 +1014,7 @@
       <w:pPr>
         <w:bidi/>
         <w:spacing w:after="0" w:line="480" w:lineRule="auto"/>
-        <w:jc w:val="start"/>
+        <w:jc w:val="right"/>
       </w:pPr>
       <w:r>
         <w:rPr>
@@ -988,7 +1034,7 @@
       <w:pPr>
         <w:bidi/>
         <w:spacing w:after="0" w:line="480" w:lineRule="auto"/>
-        <w:jc w:val="start"/>
+        <w:jc w:val="right"/>
       </w:pPr>
       <w:r>
         <w:rPr>
@@ -1008,7 +1054,7 @@
       <w:pPr>
         <w:bidi/>
         <w:spacing w:after="0" w:line="480" w:lineRule="auto"/>
-        <w:jc w:val="start"/>
+        <w:jc w:val="right"/>
       </w:pPr>
       <w:r>
         <w:rPr>
@@ -1028,7 +1074,7 @@
       <w:pPr>
         <w:bidi/>
         <w:spacing w:after="0" w:line="480" w:lineRule="auto"/>
-        <w:jc w:val="start"/>
+        <w:jc w:val="right"/>
       </w:pPr>
       <w:r>
         <w:rPr>
@@ -1048,7 +1094,7 @@
       <w:pPr>
         <w:bidi/>
         <w:spacing w:after="0" w:line="480" w:lineRule="auto"/>
-        <w:jc w:val="start"/>
+        <w:jc w:val="right"/>
       </w:pPr>
       <w:r>
         <w:rPr>
@@ -1068,7 +1114,7 @@
       <w:pPr>
         <w:bidi/>
         <w:spacing w:before="120" w:line="480" w:lineRule="auto"/>
-        <w:jc w:val="start"/>
+        <w:jc w:val="right"/>
       </w:pPr>
       <w:r>
         <w:rPr>
@@ -1088,7 +1134,7 @@
       <w:pPr>
         <w:bidi/>
         <w:spacing w:after="0" w:line="480" w:lineRule="auto"/>
-        <w:jc w:val="start"/>
+        <w:jc w:val="right"/>
       </w:pPr>
       <w:r>
         <w:rPr>
@@ -1108,7 +1154,7 @@
       <w:pPr>
         <w:bidi/>
         <w:spacing w:after="0" w:line="480" w:lineRule="auto"/>
-        <w:jc w:val="start"/>
+        <w:jc w:val="right"/>
       </w:pPr>
       <w:r>
         <w:rPr>
@@ -1128,7 +1174,7 @@
       <w:pPr>
         <w:bidi/>
         <w:spacing w:after="0" w:line="480" w:lineRule="auto"/>
-        <w:jc w:val="start"/>
+        <w:jc w:val="right"/>
       </w:pPr>
       <w:r>
         <w:rPr>
@@ -1148,7 +1194,7 @@
       <w:pPr>
         <w:bidi/>
         <w:spacing w:after="0" w:line="480" w:lineRule="auto"/>
-        <w:jc w:val="start"/>
+        <w:jc w:val="right"/>
       </w:pPr>
       <w:r>
         <w:rPr>
@@ -1168,7 +1214,7 @@
       <w:pPr>
         <w:bidi/>
         <w:spacing w:after="0" w:line="480" w:lineRule="auto"/>
-        <w:jc w:val="start"/>
+        <w:jc w:val="right"/>
       </w:pPr>
       <w:r>
         <w:rPr>
@@ -1188,7 +1234,7 @@
       <w:pPr>
         <w:bidi/>
         <w:spacing w:after="0" w:line="480" w:lineRule="auto"/>
-        <w:jc w:val="start"/>
+        <w:jc w:val="right"/>
       </w:pPr>
       <w:r>
         <w:rPr>
@@ -1209,7 +1255,7 @@
         <w:pageBreakBefore/>
         <w:bidi/>
         <w:spacing w:after="120" w:line="480" w:lineRule="auto"/>
-        <w:jc w:val="start"/>
+        <w:jc w:val="right"/>
       </w:pPr>
       <w:r>
         <w:rPr>
@@ -1230,7 +1276,7 @@
         <w:bidi/>
         <w:spacing w:line="480" w:lineRule="auto"/>
         <w:ind w:start="709" w:hanging="709"/>
-        <w:jc w:val="start"/>
+        <w:jc w:val="right"/>
       </w:pPr>
       <w:r>
         <w:rPr>
@@ -1277,7 +1323,7 @@
         <w:bidi/>
         <w:spacing w:line="480" w:lineRule="auto"/>
         <w:ind w:start="709" w:hanging="709"/>
-        <w:jc w:val="start"/>
+        <w:jc w:val="right"/>
       </w:pPr>
       <w:r>
         <w:rPr>
@@ -1324,7 +1370,7 @@
         <w:bidi/>
         <w:spacing w:line="480" w:lineRule="auto"/>
         <w:ind w:start="709" w:hanging="709"/>
-        <w:jc w:val="start"/>
+        <w:jc w:val="right"/>
       </w:pPr>
       <w:r>
         <w:rPr>
@@ -1371,7 +1417,7 @@
         <w:bidi/>
         <w:spacing w:line="480" w:lineRule="auto"/>
         <w:ind w:start="709" w:hanging="709"/>
-        <w:jc w:val="start"/>
+        <w:jc w:val="right"/>
       </w:pPr>
       <w:r>
         <w:rPr>
@@ -1418,7 +1464,7 @@
         <w:bidi/>
         <w:spacing w:line="480" w:lineRule="auto"/>
         <w:ind w:start="709" w:hanging="709"/>
-        <w:jc w:val="start"/>
+        <w:jc w:val="right"/>
       </w:pPr>
       <w:r>
         <w:rPr>
@@ -1465,7 +1511,7 @@
         <w:bidi/>
         <w:spacing w:line="480" w:lineRule="auto"/>
         <w:ind w:start="709" w:hanging="709"/>
-        <w:jc w:val="start"/>
+        <w:jc w:val="right"/>
       </w:pPr>
       <w:r>
         <w:rPr>
@@ -1512,7 +1558,7 @@
         <w:bidi/>
         <w:spacing w:line="480" w:lineRule="auto"/>
         <w:ind w:start="709" w:hanging="709"/>
-        <w:jc w:val="start"/>
+        <w:jc w:val="right"/>
       </w:pPr>
       <w:r>
         <w:rPr>
@@ -1559,7 +1605,7 @@
         <w:bidi/>
         <w:spacing w:line="480" w:lineRule="auto"/>
         <w:ind w:start="709" w:hanging="709"/>
-        <w:jc w:val="start"/>
+        <w:jc w:val="right"/>
       </w:pPr>
       <w:r>
         <w:rPr>
@@ -1606,7 +1652,7 @@
         <w:bidi/>
         <w:spacing w:line="480" w:lineRule="auto"/>
         <w:ind w:start="709" w:hanging="709"/>
-        <w:jc w:val="start"/>
+        <w:jc w:val="right"/>
       </w:pPr>
       <w:r>
         <w:rPr>
@@ -1653,7 +1699,7 @@
         <w:bidi/>
         <w:spacing w:line="480" w:lineRule="auto"/>
         <w:ind w:start="709" w:hanging="709"/>
-        <w:jc w:val="start"/>
+        <w:jc w:val="right"/>
       </w:pPr>
       <w:r>
         <w:rPr>
@@ -1700,7 +1746,7 @@
         <w:bidi/>
         <w:spacing w:line="480" w:lineRule="auto"/>
         <w:ind w:start="709" w:hanging="709"/>
-        <w:jc w:val="start"/>
+        <w:jc w:val="right"/>
       </w:pPr>
       <w:r>
         <w:rPr>
@@ -1747,7 +1793,7 @@
         <w:bidi/>
         <w:spacing w:line="480" w:lineRule="auto"/>
         <w:ind w:start="709" w:hanging="709"/>
-        <w:jc w:val="start"/>
+        <w:jc w:val="right"/>
       </w:pPr>
       <w:r>
         <w:rPr>
@@ -1794,7 +1840,7 @@
         <w:bidi/>
         <w:spacing w:line="480" w:lineRule="auto"/>
         <w:ind w:start="709" w:hanging="709"/>
-        <w:jc w:val="start"/>
+        <w:jc w:val="right"/>
       </w:pPr>
       <w:r>
         <w:rPr>
@@ -1841,7 +1887,7 @@
         <w:bidi/>
         <w:spacing w:line="480" w:lineRule="auto"/>
         <w:ind w:start="709" w:hanging="709"/>
-        <w:jc w:val="start"/>
+        <w:jc w:val="right"/>
       </w:pPr>
       <w:r>
         <w:rPr>
@@ -1888,7 +1934,7 @@
         <w:bidi/>
         <w:spacing w:line="480" w:lineRule="auto"/>
         <w:ind w:start="709" w:hanging="709"/>
-        <w:jc w:val="start"/>
+        <w:jc w:val="right"/>
       </w:pPr>
       <w:r>
         <w:rPr>
@@ -1935,7 +1981,7 @@
         <w:bidi/>
         <w:spacing w:line="480" w:lineRule="auto"/>
         <w:ind w:start="709" w:hanging="709"/>
-        <w:jc w:val="start"/>
+        <w:jc w:val="right"/>
       </w:pPr>
       <w:r>
         <w:rPr>
@@ -1982,7 +2028,7 @@
         <w:bidi/>
         <w:spacing w:line="480" w:lineRule="auto"/>
         <w:ind w:start="709" w:hanging="709"/>
-        <w:jc w:val="start"/>
+        <w:jc w:val="right"/>
       </w:pPr>
       <w:r>
         <w:rPr>
@@ -2029,7 +2075,7 @@
         <w:bidi/>
         <w:spacing w:line="480" w:lineRule="auto"/>
         <w:ind w:start="709" w:hanging="709"/>
-        <w:jc w:val="start"/>
+        <w:jc w:val="right"/>
       </w:pPr>
       <w:r>
         <w:rPr>
@@ -2076,7 +2122,7 @@
         <w:bidi/>
         <w:spacing w:line="480" w:lineRule="auto"/>
         <w:ind w:start="709" w:hanging="709"/>
-        <w:jc w:val="start"/>
+        <w:jc w:val="right"/>
       </w:pPr>
       <w:r>
         <w:rPr>
@@ -2123,7 +2169,7 @@
         <w:bidi/>
         <w:spacing w:line="480" w:lineRule="auto"/>
         <w:ind w:start="709" w:hanging="709"/>
-        <w:jc w:val="start"/>
+        <w:jc w:val="right"/>
       </w:pPr>
       <w:r>
         <w:rPr>
@@ -2170,7 +2216,7 @@
         <w:bidi/>
         <w:spacing w:line="480" w:lineRule="auto"/>
         <w:ind w:start="709" w:hanging="709"/>
-        <w:jc w:val="start"/>
+        <w:jc w:val="right"/>
       </w:pPr>
       <w:r>
         <w:rPr>
@@ -2217,7 +2263,7 @@
         <w:bidi/>
         <w:spacing w:line="480" w:lineRule="auto"/>
         <w:ind w:start="709" w:hanging="709"/>
-        <w:jc w:val="start"/>
+        <w:jc w:val="right"/>
       </w:pPr>
       <w:r>
         <w:rPr>

</xml_diff>